<commit_message>
chore: finalisasi FULL_TESIS_FIXED_v2 (DP, sinkron rujukan, Lampiran L1-L5) + snapshot working tree
</commit_message>
<xml_diff>
--- a/PUBLIKASI/ARTIKEL_RABIT.docx
+++ b/PUBLIKASI/ARTIKEL_RABIT.docx
@@ -90,7 +90,7 @@
         <w:t xml:space="preserve">semantik IndoBERT pada enam periode akademik 2019-2024. Pipeline penelitian mengintegrasikan empat komponen: (1) ekstraksi fitur semantik IndoBERT berdimensi 768; (2) reduksi dimensi PCA; (3) pemodelan GMM per periode; dan (4) otomasi analisis menggunakan </w:t>
       </w:r>
       <w:r>
-        <w:t>Hybrid Cognitive Pipeline berbasis Llama 3.2. Hasil menunjukkan bahwa pipeline berhasil mengidentifikasi 2-6 klaster per periode (K optimal bervariasi) dengan structural break pada seluruh 5 transisi, terutama 2019-2020 (ARI = -0,0036) dan 2022-2023 (ARI =</w:t>
+        <w:t>Hybrid Cognitive Pipeline berbasis Llama 3.2. Hasil menunjukkan bahwa pipeline berhasil mengidentifikasi 2 hingga 5 klaster per periode (K optimal bervariasi) dengan structural break pada seluruh 5 transisi, terutama 2019-2020 (ARI = -0,0036) dan 2022-2023 (ARI =</w:t>
       </w:r>
       <w:r>
         <w:t xml:space="preserve"> -0,0036). Integrasi GMM-IndoBERT-LLM terbukti efektif mengubah data kuantitatif kompleks menjadi narasi strategis yang dapat ditindaklanjuti untuk optimalisasi rekrutmen.</w:t>
@@ -647,31 +647,7 @@
         <w:rPr>
           <w:sz w:val="24"/>
         </w:rPr>
-        <w:t>Hasil segmentasi probabilistik GMM menunjukkan K optimal bervariasi 2-6 per periode (2019=6, 2020=6,</w:t>
-      </w:r>
-      <w:r>
-        <w:rPr>
-          <w:sz w:val="24"/>
-        </w:rPr>
-        <w:t xml:space="preserve"> 2021=6, 2022=5, 2023=2, 2024=3) dengan evaluasi multilevel menggunakan Silhouette Score, Calinski-Harabasz, dan Davies-Bouldin (Tabel 2). Meskipun nilai Silhouette Score tergolong </w:t>
-      </w:r>
-      <w:r>
-        <w:rPr>
-          <w:sz w:val="24"/>
-        </w:rPr>
-        <w:t>rendah (0,0138-0,0905), Saqr &amp; Lopez-Pernas (2024) menegaskan bahwa rentang</w:t>
-      </w:r>
-      <w:r>
-        <w:rPr>
-          <w:sz w:val="24"/>
-        </w:rPr>
-        <w:t xml:space="preserve"> 0,01-0,10 tetap bermakna untuk soft clustering probabilistik seperti GMM karena sifat inheren overlap antar segmen. Visualisasi sebaran Silhouette Score dapat dilihat pada Gambar 2. Analisis stabilitas lintas waktu menggunakan ARI membuktikan bahwa seluru</w:t>
-      </w:r>
-      <w:r>
-        <w:rPr>
-          <w:sz w:val="24"/>
-        </w:rPr>
-        <w:t>h 5 transisi merupakan structural break (ARI &lt; 0,30), mengonfirmasi bahwa asumsi segmentasi pasar yang statis di lingkungan pendidikan tinggi adalah keliru [13].</w:t>
+        <w:t>Hasil segmentasi probabilistik GMM menunjukkan K optimal bervariasi 2-5 per periode (2019=2, 2020=3, 2021=2, 2022=2, 2023=5, 2024=4) dengan evaluasi multilevel menggunakan Silhouette Score, Calinski-Harabasz, dan Davies-Bouldin (Tabel 2). Meskipun nilai Silhouette Score tergolong rendah (0,0522-0,0798), Saqr &amp; Lopez-Pernas (2024) menegaskan bahwa rentang 0,01-0,10 tetap bermakna untuk soft clustering probabilistik seperti GMM karena sifat inheren overlap antar segmen. Visualisasi sebaran Silhouette Score dapat dilihat pada Gambar 2. Analisis stabilitas lintas waktu menggunakan ARI membuktikan bahwa seluruh 5 transisi merupakan structural break (ARI &lt; 0,30), mengonfirmasi bahwa asumsi segmentasi pasar yang statis di lingkungan pendidikan tinggi adalah keliru [13].</w:t>
       </w:r>
     </w:p>
     <w:p>
@@ -1412,62 +1388,42 @@
             <w:tcW w:w="1560" w:type="dxa"/>
           </w:tcPr>
           <w:p>
-            <w:pPr>
-              <w:jc w:val="center"/>
-            </w:pPr>
-            <w:r>
-              <w:rPr>
-                <w:sz w:val="18"/>
-              </w:rPr>
-              <w:t>6</w:t>
-            </w:r>
-          </w:p>
-        </w:tc>
-        <w:tc>
-          <w:tcPr>
-            <w:tcW w:w="1560" w:type="dxa"/>
-          </w:tcPr>
-          <w:p>
-            <w:pPr>
-              <w:jc w:val="center"/>
-            </w:pPr>
-            <w:r>
-              <w:rPr>
-                <w:sz w:val="18"/>
-              </w:rPr>
-              <w:t>20.594,43</w:t>
-            </w:r>
-          </w:p>
-        </w:tc>
-        <w:tc>
-          <w:tcPr>
-            <w:tcW w:w="1560" w:type="dxa"/>
-          </w:tcPr>
-          <w:p>
-            <w:pPr>
-              <w:jc w:val="center"/>
-            </w:pPr>
-            <w:r>
-              <w:rPr>
-                <w:sz w:val="18"/>
-              </w:rPr>
-              <w:t>0,0683</w:t>
-            </w:r>
-          </w:p>
-        </w:tc>
-        <w:tc>
-          <w:tcPr>
-            <w:tcW w:w="1560" w:type="dxa"/>
-          </w:tcPr>
-          <w:p>
-            <w:pPr>
-              <w:jc w:val="center"/>
-            </w:pPr>
-            <w:r>
-              <w:rPr>
-                <w:sz w:val="18"/>
-              </w:rPr>
-              <w:t>28.991,05</w:t>
+            <w:r/>
+            <w:r>
+              <w:t>2</w:t>
+            </w:r>
+          </w:p>
+        </w:tc>
+        <w:tc>
+          <w:tcPr>
+            <w:tcW w:w="1560" w:type="dxa"/>
+          </w:tcPr>
+          <w:p>
+            <w:r/>
+            <w:r>
+              <w:t>48144</w:t>
+            </w:r>
+          </w:p>
+        </w:tc>
+        <w:tc>
+          <w:tcPr>
+            <w:tcW w:w="1560" w:type="dxa"/>
+          </w:tcPr>
+          <w:p>
+            <w:r/>
+            <w:r>
+              <w:t>0,0522</w:t>
+            </w:r>
+          </w:p>
+        </w:tc>
+        <w:tc>
+          <w:tcPr>
+            <w:tcW w:w="1560" w:type="dxa"/>
+          </w:tcPr>
+          <w:p>
+            <w:r/>
+            <w:r>
+              <w:t>-23362,01</w:t>
             </w:r>
           </w:p>
         </w:tc>
@@ -1513,62 +1469,42 @@
             <w:tcW w:w="1560" w:type="dxa"/>
           </w:tcPr>
           <w:p>
-            <w:pPr>
-              <w:jc w:val="center"/>
-            </w:pPr>
-            <w:r>
-              <w:rPr>
-                <w:sz w:val="18"/>
-              </w:rPr>
-              <w:t>6</w:t>
-            </w:r>
-          </w:p>
-        </w:tc>
-        <w:tc>
-          <w:tcPr>
-            <w:tcW w:w="1560" w:type="dxa"/>
-          </w:tcPr>
-          <w:p>
-            <w:pPr>
-              <w:jc w:val="center"/>
-            </w:pPr>
-            <w:r>
-              <w:rPr>
-                <w:sz w:val="18"/>
-              </w:rPr>
-              <w:t>66.631,38</w:t>
-            </w:r>
-          </w:p>
-        </w:tc>
-        <w:tc>
-          <w:tcPr>
-            <w:tcW w:w="1560" w:type="dxa"/>
-          </w:tcPr>
-          <w:p>
-            <w:pPr>
-              <w:jc w:val="center"/>
-            </w:pPr>
-            <w:r>
-              <w:rPr>
-                <w:sz w:val="18"/>
-              </w:rPr>
-              <w:t>0,0496</w:t>
-            </w:r>
-          </w:p>
-        </w:tc>
-        <w:tc>
-          <w:tcPr>
-            <w:tcW w:w="1560" w:type="dxa"/>
-          </w:tcPr>
-          <w:p>
-            <w:pPr>
-              <w:jc w:val="center"/>
-            </w:pPr>
-            <w:r>
-              <w:rPr>
-                <w:sz w:val="18"/>
-              </w:rPr>
-              <w:t>10.935,41</w:t>
+            <w:r/>
+            <w:r>
+              <w:t>3</w:t>
+            </w:r>
+          </w:p>
+        </w:tc>
+        <w:tc>
+          <w:tcPr>
+            <w:tcW w:w="1560" w:type="dxa"/>
+          </w:tcPr>
+          <w:p>
+            <w:r/>
+            <w:r>
+              <w:t>88759</w:t>
+            </w:r>
+          </w:p>
+        </w:tc>
+        <w:tc>
+          <w:tcPr>
+            <w:tcW w:w="1560" w:type="dxa"/>
+          </w:tcPr>
+          <w:p>
+            <w:r/>
+            <w:r>
+              <w:t>0,0798</w:t>
+            </w:r>
+          </w:p>
+        </w:tc>
+        <w:tc>
+          <w:tcPr>
+            <w:tcW w:w="1560" w:type="dxa"/>
+          </w:tcPr>
+          <w:p>
+            <w:r/>
+            <w:r>
+              <w:t>-43178,07</w:t>
             </w:r>
           </w:p>
         </w:tc>
@@ -1614,62 +1550,42 @@
             <w:tcW w:w="1560" w:type="dxa"/>
           </w:tcPr>
           <w:p>
-            <w:pPr>
-              <w:jc w:val="center"/>
-            </w:pPr>
-            <w:r>
-              <w:rPr>
-                <w:sz w:val="18"/>
-              </w:rPr>
-              <w:t>6</w:t>
-            </w:r>
-          </w:p>
-        </w:tc>
-        <w:tc>
-          <w:tcPr>
-            <w:tcW w:w="1560" w:type="dxa"/>
-          </w:tcPr>
-          <w:p>
-            <w:pPr>
-              <w:jc w:val="center"/>
-            </w:pPr>
-            <w:r>
-              <w:rPr>
-                <w:sz w:val="18"/>
-              </w:rPr>
-              <w:t>80.792,73</w:t>
-            </w:r>
-          </w:p>
-        </w:tc>
-        <w:tc>
-          <w:tcPr>
-            <w:tcW w:w="1560" w:type="dxa"/>
-          </w:tcPr>
-          <w:p>
-            <w:pPr>
-              <w:jc w:val="center"/>
-            </w:pPr>
-            <w:r>
-              <w:rPr>
-                <w:sz w:val="18"/>
-              </w:rPr>
-              <w:t>0,0585</w:t>
-            </w:r>
-          </w:p>
-        </w:tc>
-        <w:tc>
-          <w:tcPr>
-            <w:tcW w:w="1560" w:type="dxa"/>
-          </w:tcPr>
-          <w:p>
-            <w:pPr>
-              <w:jc w:val="center"/>
-            </w:pPr>
-            <w:r>
-              <w:rPr>
-                <w:sz w:val="18"/>
-              </w:rPr>
-              <w:t>4.595,64</w:t>
+            <w:r/>
+            <w:r>
+              <w:t>2</w:t>
+            </w:r>
+          </w:p>
+        </w:tc>
+        <w:tc>
+          <w:tcPr>
+            <w:tcW w:w="1560" w:type="dxa"/>
+          </w:tcPr>
+          <w:p>
+            <w:r/>
+            <w:r>
+              <w:t>92635</w:t>
+            </w:r>
+          </w:p>
+        </w:tc>
+        <w:tc>
+          <w:tcPr>
+            <w:tcW w:w="1560" w:type="dxa"/>
+          </w:tcPr>
+          <w:p>
+            <w:r/>
+            <w:r>
+              <w:t>0,0748</w:t>
+            </w:r>
+          </w:p>
+        </w:tc>
+        <w:tc>
+          <w:tcPr>
+            <w:tcW w:w="1560" w:type="dxa"/>
+          </w:tcPr>
+          <w:p>
+            <w:r/>
+            <w:r>
+              <w:t>-45504,40</w:t>
             </w:r>
           </w:p>
         </w:tc>
@@ -1715,62 +1631,42 @@
             <w:tcW w:w="1560" w:type="dxa"/>
           </w:tcPr>
           <w:p>
-            <w:pPr>
-              <w:jc w:val="center"/>
-            </w:pPr>
-            <w:r>
-              <w:rPr>
-                <w:sz w:val="18"/>
-              </w:rPr>
-              <w:t>5</w:t>
-            </w:r>
-          </w:p>
-        </w:tc>
-        <w:tc>
-          <w:tcPr>
-            <w:tcW w:w="1560" w:type="dxa"/>
-          </w:tcPr>
-          <w:p>
-            <w:pPr>
-              <w:jc w:val="center"/>
-            </w:pPr>
-            <w:r>
-              <w:rPr>
-                <w:sz w:val="18"/>
-              </w:rPr>
-              <w:t>138.331,39</w:t>
-            </w:r>
-          </w:p>
-        </w:tc>
-        <w:tc>
-          <w:tcPr>
-            <w:tcW w:w="1560" w:type="dxa"/>
-          </w:tcPr>
-          <w:p>
-            <w:pPr>
-              <w:jc w:val="center"/>
-            </w:pPr>
-            <w:r>
-              <w:rPr>
-                <w:sz w:val="18"/>
-              </w:rPr>
-              <w:t>0,0138</w:t>
-            </w:r>
-          </w:p>
-        </w:tc>
-        <w:tc>
-          <w:tcPr>
-            <w:tcW w:w="1560" w:type="dxa"/>
-          </w:tcPr>
-          <w:p>
-            <w:pPr>
-              <w:jc w:val="center"/>
-            </w:pPr>
-            <w:r>
-              <w:rPr>
-                <w:sz w:val="18"/>
-              </w:rPr>
-              <w:t>-28.915,23</w:t>
+            <w:r/>
+            <w:r>
+              <w:t>2</w:t>
+            </w:r>
+          </w:p>
+        </w:tc>
+        <w:tc>
+          <w:tcPr>
+            <w:tcW w:w="1560" w:type="dxa"/>
+          </w:tcPr>
+          <w:p>
+            <w:r/>
+            <w:r>
+              <w:t>143514</w:t>
+            </w:r>
+          </w:p>
+        </w:tc>
+        <w:tc>
+          <w:tcPr>
+            <w:tcW w:w="1560" w:type="dxa"/>
+          </w:tcPr>
+          <w:p>
+            <w:r/>
+            <w:r>
+              <w:t>0,0663</w:t>
+            </w:r>
+          </w:p>
+        </w:tc>
+        <w:tc>
+          <w:tcPr>
+            <w:tcW w:w="1560" w:type="dxa"/>
+          </w:tcPr>
+          <w:p>
+            <w:r/>
+            <w:r>
+              <w:t>-70883,68</w:t>
             </w:r>
           </w:p>
         </w:tc>
@@ -1816,62 +1712,42 @@
             <w:tcW w:w="1560" w:type="dxa"/>
           </w:tcPr>
           <w:p>
-            <w:pPr>
-              <w:jc w:val="center"/>
-            </w:pPr>
-            <w:r>
-              <w:rPr>
-                <w:sz w:val="18"/>
-              </w:rPr>
-              <w:t>2</w:t>
-            </w:r>
-          </w:p>
-        </w:tc>
-        <w:tc>
-          <w:tcPr>
-            <w:tcW w:w="1560" w:type="dxa"/>
-          </w:tcPr>
-          <w:p>
-            <w:pPr>
-              <w:jc w:val="center"/>
-            </w:pPr>
-            <w:r>
-              <w:rPr>
-                <w:sz w:val="18"/>
-              </w:rPr>
-              <w:t>212.737,22</w:t>
-            </w:r>
-          </w:p>
-        </w:tc>
-        <w:tc>
-          <w:tcPr>
-            <w:tcW w:w="1560" w:type="dxa"/>
-          </w:tcPr>
-          <w:p>
-            <w:pPr>
-              <w:jc w:val="center"/>
-            </w:pPr>
-            <w:r>
-              <w:rPr>
-                <w:sz w:val="18"/>
-              </w:rPr>
-              <w:t>0,0905</w:t>
-            </w:r>
-          </w:p>
-        </w:tc>
-        <w:tc>
-          <w:tcPr>
-            <w:tcW w:w="1560" w:type="dxa"/>
-          </w:tcPr>
-          <w:p>
-            <w:pPr>
-              <w:jc w:val="center"/>
-            </w:pPr>
-            <w:r>
-              <w:rPr>
-                <w:sz w:val="18"/>
-              </w:rPr>
-              <w:t>-89.231,81</w:t>
+            <w:r/>
+            <w:r>
+              <w:t>5</w:t>
+            </w:r>
+          </w:p>
+        </w:tc>
+        <w:tc>
+          <w:tcPr>
+            <w:tcW w:w="1560" w:type="dxa"/>
+          </w:tcPr>
+          <w:p>
+            <w:r/>
+            <w:r>
+              <w:t>214845</w:t>
+            </w:r>
+          </w:p>
+        </w:tc>
+        <w:tc>
+          <w:tcPr>
+            <w:tcW w:w="1560" w:type="dxa"/>
+          </w:tcPr>
+          <w:p>
+            <w:r/>
+            <w:r>
+              <w:t>0,0691</w:t>
+            </w:r>
+          </w:p>
+        </w:tc>
+        <w:tc>
+          <w:tcPr>
+            <w:tcW w:w="1560" w:type="dxa"/>
+          </w:tcPr>
+          <w:p>
+            <w:r/>
+            <w:r>
+              <w:t>-105094,15</w:t>
             </w:r>
           </w:p>
         </w:tc>
@@ -1918,62 +1794,42 @@
             <w:tcW w:w="1560" w:type="dxa"/>
           </w:tcPr>
           <w:p>
-            <w:pPr>
-              <w:jc w:val="center"/>
-            </w:pPr>
-            <w:r>
-              <w:rPr>
-                <w:sz w:val="18"/>
-              </w:rPr>
-              <w:t>3</w:t>
-            </w:r>
-          </w:p>
-        </w:tc>
-        <w:tc>
-          <w:tcPr>
-            <w:tcW w:w="1560" w:type="dxa"/>
-          </w:tcPr>
-          <w:p>
-            <w:pPr>
-              <w:jc w:val="center"/>
-            </w:pPr>
-            <w:r>
-              <w:rPr>
-                <w:sz w:val="18"/>
-              </w:rPr>
-              <w:t>163.307,13</w:t>
-            </w:r>
-          </w:p>
-        </w:tc>
-        <w:tc>
-          <w:tcPr>
-            <w:tcW w:w="1560" w:type="dxa"/>
-          </w:tcPr>
-          <w:p>
-            <w:pPr>
-              <w:jc w:val="center"/>
-            </w:pPr>
-            <w:r>
-              <w:rPr>
-                <w:sz w:val="18"/>
-              </w:rPr>
-              <w:t>0,0279</w:t>
-            </w:r>
-          </w:p>
-        </w:tc>
-        <w:tc>
-          <w:tcPr>
-            <w:tcW w:w="1560" w:type="dxa"/>
-          </w:tcPr>
-          <w:p>
-            <w:pPr>
-              <w:jc w:val="center"/>
-            </w:pPr>
-            <w:r>
-              <w:rPr>
-                <w:sz w:val="18"/>
-              </w:rPr>
-              <w:t>-57.135,11</w:t>
+            <w:r/>
+            <w:r>
+              <w:t>4</w:t>
+            </w:r>
+          </w:p>
+        </w:tc>
+        <w:tc>
+          <w:tcPr>
+            <w:tcW w:w="1560" w:type="dxa"/>
+          </w:tcPr>
+          <w:p>
+            <w:r/>
+            <w:r>
+              <w:t>153715</w:t>
+            </w:r>
+          </w:p>
+        </w:tc>
+        <w:tc>
+          <w:tcPr>
+            <w:tcW w:w="1560" w:type="dxa"/>
+          </w:tcPr>
+          <w:p>
+            <w:r/>
+            <w:r>
+              <w:t>0,0585</w:t>
+            </w:r>
+          </w:p>
+        </w:tc>
+        <w:tc>
+          <w:tcPr>
+            <w:tcW w:w="1560" w:type="dxa"/>
+          </w:tcPr>
+          <w:p>
+            <w:r/>
+            <w:r>
+              <w:t>-75081,63</w:t>
             </w:r>
           </w:p>
         </w:tc>
@@ -2100,7 +1956,7 @@
         <w:rPr>
           <w:sz w:val="24"/>
         </w:rPr>
-        <w:t xml:space="preserve"> preferensi pendaftar akibat pandemi. Pada fase pemulihan akhir (2022→2023), kembali terjadi guncangan struktural dengan ARI = -0,0036, di mana dominasi program studi IT mengalami konsolidasi ekstrem ke satu segmen (92,6%). Transisi 2020→2021 (ARI = 0,0160</w:t>
+        <w:t xml:space="preserve"> preferensi pendaftar akibat pandemi. Pada fase pemulihan akhir (2022→2023), kembali terjadi guncangan struktural dengan ARI = -0,0036, di mana dominasi program studi IT mengalami pembagian ke lima segmen (K=5) dengan segmen dominan 50,1%. Transisi 2020→2021 (ARI = 0,0160</w:t>
       </w:r>
       <w:r>
         <w:rPr>
@@ -2875,41 +2731,7 @@
         <w:spacing w:after="60" w:line="276" w:lineRule="auto"/>
       </w:pPr>
       <w:r>
-        <w:rPr>
-          <w:sz w:val="24"/>
-        </w:rPr>
-        <w:t xml:space="preserve">Perbandingan GMM dengan K-Means (Tabel 4) menunjukkan bahwa secara metrik numerik K-Means unggul (Silhouette 0,0722 vs 0,0279, CH Index 40,75 vs 18,01, DB </w:t>
-      </w:r>
-      <w:r>
-        <w:rPr>
-          <w:sz w:val="24"/>
-        </w:rPr>
-        <w:t>Index 2,97 vs 4,19 untuk data 2024), namun GMM unggul secara fundamental pada aspek yang tidak dapat dipenuhi K-Means: posterior probability per observasi yang menjadi basis reasoning kausal LLM, proyeksi segmen 2025 (592 pendaftar), dan deteksi kemunculan</w:t>
-      </w:r>
-      <w:r>
-        <w:rPr>
-          <w:sz w:val="24"/>
-        </w:rPr>
-        <w:t xml:space="preserve"> segmen baru seperti D3 Akuntansi yang tidak terdeteksi oleh clustering keras [9]. Hybrid Cognitive Pipeline berhasil mengubah data kuantitatif yang kompleks menjadi narasi manajerial yang dapat ditindaklanjuti. Model Ollama lokal memastikan keamanan priva</w:t>
-      </w:r>
-      <w:r>
-        <w:rPr>
-          <w:sz w:val="24"/>
-        </w:rPr>
-        <w:t xml:space="preserve">si data (PII) sebelum metadata yang diagregasi diproses oleh model kognitif tingkat lanjut di cloud. Validasi pakar menghasilkan skor rata-rata 4,0/5,0 (kategori valid/layak), mengonfirmasi bahwa rekomendasi </w:t>
-      </w:r>
-      <w:r>
-        <w:rPr>
-          <w:sz w:val="24"/>
-        </w:rPr>
-        <w:lastRenderedPageBreak/>
-        <w:t>diferensiasi channel pemasaran dan strategi rekr</w:t>
-      </w:r>
-      <w:r>
-        <w:rPr>
-          <w:sz w:val="24"/>
-        </w:rPr>
-        <w:t>utmen telah selaras secara akurat dengan pola data aktual [15].</w:t>
+        <w:t>Perbandingan GMM dengan K-Means (Tabel 4) menunjukkan bahwa secara metrik numerik K-Means unggul (Silhouette 0,0722 vs 0,0585, CH Index 40,75 vs 27,19, DB Index 2,97 vs 3,1211 untuk data 2024), namun GMM unggul secara fundamental pada aspek yang tidak dapat dipenuhi K-Means: posterior probability per observasi yang menjadi basis reasoning kausal LLM, proyeksi segmen 2025 (592 pendaftar), dan deteksi kemunculan segmen baru seperti D3 Akuntansi yang tidak terdeteksi oleh clustering keras [9]. Hybrid Cognitive Pipeline berhasil mengubah data kuantitatif yang kompleks menjadi narasi manajerial yang dapat ditindaklanjuti. Model Ollama lokal memastikan keamanan privasi data (PII) sebelum metadata yang diagregasi diproses oleh model kognitif tingkat lanjut di cloud. Validasi pakar menghasilkan skor rata-rata 4,0/5,0 (kategori valid/layak), mengonfirmasi bahwa rekomendasi diferensiasi channel pemasaran dan strategi rekrutmen telah selaras secara akurat dengan pola data aktual [15].</w:t>
       </w:r>
     </w:p>
     <w:p>
@@ -3029,14 +2851,8 @@
             <w:tcW w:w="3119" w:type="dxa"/>
           </w:tcPr>
           <w:p>
-            <w:pPr>
-              <w:jc w:val="center"/>
-            </w:pPr>
-            <w:r>
-              <w:rPr>
-                <w:sz w:val="18"/>
-              </w:rPr>
-              <w:t>0,0905</w:t>
+            <w:r>
+              <w:t>0,0691</w:t>
             </w:r>
           </w:p>
         </w:tc>
@@ -3082,14 +2898,8 @@
             <w:tcW w:w="3119" w:type="dxa"/>
           </w:tcPr>
           <w:p>
-            <w:pPr>
-              <w:jc w:val="center"/>
-            </w:pPr>
-            <w:r>
-              <w:rPr>
-                <w:sz w:val="18"/>
-              </w:rPr>
-              <w:t>0,0279</w:t>
+            <w:r>
+              <w:t>0,0585</w:t>
             </w:r>
           </w:p>
         </w:tc>
@@ -3135,14 +2945,8 @@
             <w:tcW w:w="3119" w:type="dxa"/>
           </w:tcPr>
           <w:p>
-            <w:pPr>
-              <w:jc w:val="center"/>
-            </w:pPr>
-            <w:r>
-              <w:rPr>
-                <w:sz w:val="18"/>
-              </w:rPr>
-              <w:t>18,01</w:t>
+            <w:r>
+              <w:t>27,19</w:t>
             </w:r>
           </w:p>
         </w:tc>
@@ -3188,14 +2992,8 @@
             <w:tcW w:w="3119" w:type="dxa"/>
           </w:tcPr>
           <w:p>
-            <w:pPr>
-              <w:jc w:val="center"/>
-            </w:pPr>
-            <w:r>
-              <w:rPr>
-                <w:sz w:val="18"/>
-              </w:rPr>
-              <w:t>4,19</w:t>
+            <w:r>
+              <w:t>3,1211</w:t>
             </w:r>
           </w:p>
         </w:tc>
@@ -4808,19 +4606,7 @@
         <w:rPr>
           <w:sz w:val="24"/>
         </w:rPr>
-        <w:t>Profil klaster pada Tabel 6 menunjukkan perubahan distribusi yang konsisten dengan temuan structural break. Pada 2019 terdapat 4 kla</w:t>
-      </w:r>
-      <w:r>
-        <w:rPr>
-          <w:sz w:val="24"/>
-        </w:rPr>
-        <w:t>ster dengan sebaran relatif merata (15,8%-28,8%), semuanya berasal dari Kabupaten Pekalongan. Pada 2023 terjadi konsolidasi drastis: klaster K3 menyerap 76,9% dari 680 pendaftar dengan dominasi Sarjana Informatika (164 dari 523). Pada 2024 konsolidasi sema</w:t>
-      </w:r>
-      <w:r>
-        <w:rPr>
-          <w:sz w:val="24"/>
-        </w:rPr>
-        <w:t>kin ekstrem dengan K1 mencapai 94,6% dan munculnya program D3 Akuntansi sebagai segmen baru. Visualisasi sebaran spasial klaster pada ruang PCA 2D untuk ketiga tahun representatif disajikan pada Gambar 4, Gambar 5, dan Gambar 6 [13].</w:t>
+        <w:t>Pada 2019 terdapat 2 klaster dengan sebaran 65,1% (Klaster 1) dan 34,9% (Klaster 2), semuanya berasal dari Kabupaten Pekalongan. Pada 2023 konsolidasi dengan K=5: klaster terbesar (K5) menyerap 50,1% dari 680 pendaftar dengan dominasi Sarjana Informatika (115 dari 341). Pada 2024 komposisi lebih merata dengan K=4: K4=33,6%, K1=29,8%, K2=29,0%, K3=7,6% (N=503), dan munculnya program D3 Akuntansi sebagai segmen baru. Visualisasi sebaran spasial klaster pada ruang PCA 2D untuk ketiga tahun representatif disajikan pada Gambar 4, Gambar 5, dan Gambar 6 [13].</w:t>
       </w:r>
     </w:p>
     <w:p>
@@ -5081,19 +4867,7 @@
         <w:rPr>
           <w:sz w:val="24"/>
         </w:rPr>
-        <w:t>Pertama, efektivitas integrasi segmentasi probabilistik dan ekstraksi semantik. Penelitian ini secara empiris membuktikan bahwa integrasi antara representasi ruang vektor berdimensi 768</w:t>
-      </w:r>
-      <w:r>
-        <w:rPr>
-          <w:sz w:val="24"/>
-        </w:rPr>
-        <w:t xml:space="preserve"> dari IndoBERT dengan soft clustering probabilistik GMM sangat efektif dalam memetakan profil calon mahasiswa secara presisi. Dari dataset 2.362 pendaftar, pendekatan ini sukses mengidentifikasi K optimal yang bervariasi 2-6 per periode (2019=6, 2020=6, 20</w:t>
-      </w:r>
-      <w:r>
-        <w:rPr>
-          <w:sz w:val="24"/>
-        </w:rPr>
-        <w:t>21=6, 2022=5, 2023=2, 2024=3), dengan konsolidasi dari 6 klaster pada fase pra-pandemi menjadi 2-3 klaster pada fase recovery.</w:t>
+        <w:t>Dari dataset 2.362 pendaftar, pendekatan ini sukses mengidentifikasi K optimal yang bervariasi 2-5 per periode (2019=2, 2020=3, 2021=2, 2022=2, 2023=5, 2024=4), dengan konsolidasi dari 2 klaster pada fase awal menjadi 4-5 klaster pada fase recovery.</w:t>
       </w:r>
     </w:p>
     <w:p>

</xml_diff>